<commit_message>
﻿feat: S04 - 4 ideias da investigacao mundial de formacoes Copilot+Word
(1) Contraste prompt fraco vs GCSE no exercicio guiado (escada de
prompts, Microsoft Learn); (2) decisao formal Manter/Regenerar/
Descartar na demo do Draft (doc oficial); (3) cronometro do CCC com
evidencia do piloto australiano (verificacao anulou parte dos ganhos);
(4) numeros do experimento do governo britanico na Ideia central
(drafting poupa 24 min/dia + supervisao humana permanente).

Reservadas para S05-S15: grelha cega accuracy/quality, propagacao de
casos de uso, mini-desafios entre sessoes, formato prompt-a-thon.

Co-Authored-By: Claude Fable 5 <noreply@anthropic.com>
</commit_message>
<xml_diff>
--- a/sessoes/sessao-04/Worksheet_S04_Word_Oficios.docx
+++ b/sessoes/sessao-04/Worksheet_S04_Word_Oficios.docx
@@ -3069,7 +3069,36 @@
         <w:t xml:space="preserve"> </w:t>
       </w:r>
       <w:r>
-        <w:t xml:space="preserve">No Copilot (no Word, com licença; no Copilot Chat, sem licença — cola primeiro o texto do DOC-A), escreve o seguinte prompt usando GCSE:</w:t>
+        <w:t xml:space="preserve">No Copilot (no Word, com licença; no Copilot Chat, sem licença — cola primeiro o texto do DOC-A), faz o contraste em dois tempos: corre primeiro,</w:t>
+      </w:r>
+      <w:r>
+        <w:t xml:space="preserve"> </w:t>
+      </w:r>
+      <w:r>
+        <w:rPr>
+          <w:b/>
+          <w:bCs/>
+        </w:rPr>
+        <w:t xml:space="preserve">tal e qual</w:t>
+      </w:r>
+      <w:r>
+        <w:t xml:space="preserve">, o prompt fraco da S03 —</w:t>
+      </w:r>
+      <w:r>
+        <w:t xml:space="preserve"> </w:t>
+      </w:r>
+      <w:r>
+        <w:rPr>
+          <w:i/>
+          <w:iCs/>
+        </w:rPr>
+        <w:t xml:space="preserve">"Resume este regulamento."</w:t>
+      </w:r>
+      <w:r>
+        <w:t xml:space="preserve"> </w:t>
+      </w:r>
+      <w:r>
+        <w:t xml:space="preserve">— e guarda o output. Depois corre o prompt completo usando GCSE:</w:t>
       </w:r>
     </w:p>
     <w:tbl>
@@ -3375,6 +3404,31 @@
       </w:r>
       <w:r>
         <w:t xml:space="preserve">foi capturada corretamente — incluindo os limites (≤14 valores, uma única melhoria)?</w:t>
+      </w:r>
+    </w:p>
+    <w:p>
+      <w:pPr>
+        <w:pStyle w:val="Compact"/>
+        <w:numPr>
+          <w:ilvl w:val="0"/>
+          <w:numId w:val="1018"/>
+        </w:numPr>
+      </w:pPr>
+      <w:r>
+        <w:t xml:space="preserve">□</w:t>
+      </w:r>
+      <w:r>
+        <w:t xml:space="preserve"> </w:t>
+      </w:r>
+      <w:r>
+        <w:rPr>
+          <w:b/>
+          <w:bCs/>
+        </w:rPr>
+        <w:t xml:space="preserve">Compara com o output do prompt fraco</w:t>
+      </w:r>
+      <w:r>
+        <w:t xml:space="preserve">: o que é que o GCSE acrescentou (estrutura? artigos citados? termos preservados?)? ____________________________</w:t>
       </w:r>
     </w:p>
     <w:p>
@@ -4089,6 +4143,40 @@
       </w:pPr>
       <w:r>
         <w:t xml:space="preserve">Anota qualquer divergência</w:t>
+      </w:r>
+    </w:p>
+    <w:p>
+      <w:pPr>
+        <w:pStyle w:val="FirstParagraph"/>
+      </w:pPr>
+      <w:r>
+        <w:t xml:space="preserve">⏱</w:t>
+      </w:r>
+      <w:r>
+        <w:t xml:space="preserve"> </w:t>
+      </w:r>
+      <w:r>
+        <w:rPr>
+          <w:b/>
+          <w:bCs/>
+        </w:rPr>
+        <w:t xml:space="preserve">E cronometra a validação.</w:t>
+      </w:r>
+      <w:r>
+        <w:t xml:space="preserve"> </w:t>
+      </w:r>
+      <w:r>
+        <w:t xml:space="preserve">No piloto australiano (7 600 funcionários da administração pública), o tempo de verificação anulou parte dos ganhos de eficiência — o CCC existe exatamente para isso. Se a tua validação demorou ~1 minuto, acabaste de proteger os outros minutos que o Copilot te poupou.</w:t>
+      </w:r>
+      <w:r>
+        <w:t xml:space="preserve"> </w:t>
+      </w:r>
+      <w:r>
+        <w:rPr>
+          <w:b/>
+          <w:bCs/>
+        </w:rPr>
+        <w:t xml:space="preserve">Tempo do meu CCC: ______</w:t>
       </w:r>
     </w:p>
     <w:bookmarkEnd w:id="33"/>

</xml_diff>